<commit_message>
Conform Bab II to Panduan TA SI Universitas Muhammadiyah Jember template
Updates skripsi/bab_2_tinjauan_pustaka.md: heading rendered as "BAB 2" /
"TINJAUAN PUSTAKA" (Arabic numeral, matching Lampiran 13 format), in-text
citations switched to Indonesian style (dan for two authors, dkk. for
three or more, replacing all "&"), and foreign/technical terms
italicized throughout (data-driven, hyperplane, sparse, deep learning,
crawling, etc.) per the guideline's tata bahasa rules.

Co-Authored-By: Claude Sonnet 5 <noreply@anthropic.com>
Claude-Session: https://claude.ai/code/session_012GsMtoJaFpqnvD8d8kDjDX
</commit_message>
<xml_diff>
--- a/skripsi/bab_2_tinjauan_pustaka.docx
+++ b/skripsi/bab_2_tinjauan_pustaka.docx
@@ -14,7 +14,22 @@
           <w:color w:val="000000"/>
           <w:sz w:val="24"/>
         </w:rPr>
-        <w:t>BAB II TINJAUAN PUSTAKA</w:t>
+        <w:t>BAB 2</w:t>
+      </w:r>
+    </w:p>
+    <w:p>
+      <w:pPr>
+        <w:pStyle w:val="Heading1"/>
+        <w:jc w:val="center"/>
+      </w:pPr>
+      <w:r>
+        <w:rPr>
+          <w:rFonts w:ascii="Times New Roman" w:hAnsi="Times New Roman"/>
+          <w:b/>
+          <w:color w:val="000000"/>
+          <w:sz w:val="24"/>
+        </w:rPr>
+        <w:t>TINJAUAN PUSTAKA</w:t>
       </w:r>
     </w:p>
     <w:p>
@@ -52,7 +67,16 @@
         <w:jc w:val="both"/>
       </w:pPr>
       <w:r>
-        <w:t>Analisis sentimen adalah proses komputasional untuk mengidentifikasi dan mengklasifikasikan orientasi opini yang terkandung dalam suatu teks, umumnya ke dalam kategori positif, negatif, atau netral. Pada konteks kebijakan publik, analisis sentimen digunakan untuk memahami reaksi masyarakat terhadap suatu program pemerintah berdasarkan opini yang dinyatakan secara terbuka di media sosial. Hasil analisis ini dapat menjadi salah satu bentuk pemantauan opini yang bersifat data-driven, melengkapi metode survei konvensional.</w:t>
+        <w:t xml:space="preserve">Analisis sentimen adalah proses komputasional untuk mengidentifikasi dan mengklasifikasikan orientasi opini yang terkandung dalam suatu teks, umumnya ke dalam kategori positif, negatif, atau netral. Pada konteks kebijakan publik, analisis sentimen digunakan untuk memahami reaksi masyarakat terhadap suatu program pemerintah berdasarkan opini yang dinyatakan secara terbuka di media sosial. Hasil analisis ini dapat menjadi salah satu bentuk pemantauan opini yang bersifat </w:t>
+      </w:r>
+      <w:r>
+        <w:rPr>
+          <w:i/>
+        </w:rPr>
+        <w:t>data-driven</w:t>
+      </w:r>
+      <w:r>
+        <w:t>, melengkapi metode survei konvensional.</w:t>
       </w:r>
     </w:p>
     <w:p>
@@ -75,7 +99,61 @@
         <w:jc w:val="both"/>
       </w:pPr>
       <w:r>
-        <w:t>TF-IDF merupakan metode pembobotan fitur teks yang memberikan nilai lebih tinggi pada kata yang sering muncul dalam suatu dokumen namun jarang muncul pada keseluruhan korpus (Manning, Raghavan, &amp; Schütze, 2008). Metode ini banyak digunakan sebagai representasi fitur pada tugas klasifikasi teks karena kesederhanaannya dan efektivitasnya, terutama ketika dikombinasikan dengan pengaturan unigram dan bigram, ambang batas frekuensi dokumen minimum dan maksimum (min_df, max_df), serta penskalaan logaritmik pada frekuensi term (sublinear_tf).</w:t>
+        <w:t xml:space="preserve">TF-IDF merupakan metode pembobotan fitur teks yang memberikan nilai lebih tinggi pada kata yang sering muncul dalam suatu dokumen namun jarang muncul pada keseluruhan korpus (Manning dkk., 2008). Metode ini banyak digunakan sebagai representasi fitur pada tugas klasifikasi teks karena kesederhanaannya dan efektivitasnya, terutama ketika dikombinasikan dengan pengaturan </w:t>
+      </w:r>
+      <w:r>
+        <w:rPr>
+          <w:i/>
+        </w:rPr>
+        <w:t>unigram</w:t>
+      </w:r>
+      <w:r>
+        <w:t xml:space="preserve"> dan </w:t>
+      </w:r>
+      <w:r>
+        <w:rPr>
+          <w:i/>
+        </w:rPr>
+        <w:t>bigram</w:t>
+      </w:r>
+      <w:r>
+        <w:t>, ambang batas frekuensi dokumen minimum dan maksimum (</w:t>
+      </w:r>
+      <w:r>
+        <w:rPr>
+          <w:i/>
+        </w:rPr>
+        <w:t>min_df</w:t>
+      </w:r>
+      <w:r>
+        <w:t xml:space="preserve">, </w:t>
+      </w:r>
+      <w:r>
+        <w:rPr>
+          <w:i/>
+        </w:rPr>
+        <w:t>max_df</w:t>
+      </w:r>
+      <w:r>
+        <w:t xml:space="preserve">), serta penskalaan logaritmik pada frekuensi </w:t>
+      </w:r>
+      <w:r>
+        <w:rPr>
+          <w:i/>
+        </w:rPr>
+        <w:t>term</w:t>
+      </w:r>
+      <w:r>
+        <w:t xml:space="preserve"> (</w:t>
+      </w:r>
+      <w:r>
+        <w:rPr>
+          <w:i/>
+        </w:rPr>
+        <w:t>sublinear_tf</w:t>
+      </w:r>
+      <w:r>
+        <w:t>).</w:t>
       </w:r>
     </w:p>
     <w:p>
@@ -98,7 +176,40 @@
         <w:jc w:val="both"/>
       </w:pPr>
       <w:r>
-        <w:t>Support Vector Machine adalah algoritma klasifikasi yang bekerja dengan mencari hyperplane pemisah dengan margin maksimal antar kelas pada ruang fitur (Cortes &amp; Vapnik, 1995). SVM dikenal efektif pada data berdimensi tinggi dan jarang (sparse), sehingga cocok digunakan bersama representasi fitur TF-IDF pada tugas klasifikasi teks. SVM dapat menggunakan kernel linear untuk data yang dapat dipisahkan secara linear, maupun kernel non-linear seperti Radial Basis Function (RBF) untuk pola yang lebih kompleks.</w:t>
+        <w:rPr>
+          <w:i/>
+        </w:rPr>
+        <w:t>Support Vector Machine</w:t>
+      </w:r>
+      <w:r>
+        <w:t xml:space="preserve"> adalah algoritma klasifikasi yang bekerja dengan mencari </w:t>
+      </w:r>
+      <w:r>
+        <w:rPr>
+          <w:i/>
+        </w:rPr>
+        <w:t>hyperplane</w:t>
+      </w:r>
+      <w:r>
+        <w:t xml:space="preserve"> pemisah dengan margin maksimal antar kelas pada ruang fitur (Cortes dan Vapnik, 1995). SVM dikenal efektif pada data berdimensi tinggi dan jarang (</w:t>
+      </w:r>
+      <w:r>
+        <w:rPr>
+          <w:i/>
+        </w:rPr>
+        <w:t>sparse</w:t>
+      </w:r>
+      <w:r>
+        <w:t xml:space="preserve">), sehingga cocok digunakan bersama representasi fitur TF-IDF pada tugas klasifikasi teks. SVM dapat menggunakan kernel linear untuk data yang dapat dipisahkan secara linear, maupun kernel non-linear seperti </w:t>
+      </w:r>
+      <w:r>
+        <w:rPr>
+          <w:i/>
+        </w:rPr>
+        <w:t>Radial Basis Function</w:t>
+      </w:r>
+      <w:r>
+        <w:t xml:space="preserve"> (RBF) untuk pola yang lebih kompleks.</w:t>
       </w:r>
     </w:p>
     <w:p>
@@ -121,7 +232,43 @@
         <w:jc w:val="both"/>
       </w:pPr>
       <w:r>
-        <w:t>Pelabelan data berbantuan AI (AI-assisted labeling) merupakan pendekatan penyusunan dataset berlabel yang menggabungkan proses otomatis dengan peninjauan manusia untuk mempercepat proses anotasi tanpa sepenuhnya mengorbankan kualitas label. Nasution dan Onan (2024) menunjukkan bahwa label yang dihasilkan oleh Large Language Model dapat mendekati kualitas label manusia pada tugas NLP bahasa bersumber daya rendah, namun tetap memiliki celah pada kasus linguistik yang kompleks. Jadhav dkk. (2025) juga menegaskan bahwa performa LLM sebagai anotator masih tertinggal dibandingkan model yang di-fine-tune secara khusus ketika diterapkan pada bahasa bersumber daya rendah. Selain pendekatan berbasis LLM, terdapat pula pendekatan pelabelan awal semi-otomatis berbasis aturan (rule-based), yang menggunakan daftar kata kunci atau pola linguistik sederhana untuk memberikan label awal sebelum dilakukan adjudikasi manual. Pendekatan semacam ini belum banyak dievaluasi secara eksplisit dari sisi pola kesalahan sistematis yang mungkin ditinggalkannya.</w:t>
+        <w:t>Pelabelan data berbantuan AI (</w:t>
+      </w:r>
+      <w:r>
+        <w:rPr>
+          <w:i/>
+        </w:rPr>
+        <w:t>AI-assisted labeling</w:t>
+      </w:r>
+      <w:r>
+        <w:t xml:space="preserve">) merupakan pendekatan penyusunan dataset berlabel yang menggabungkan proses otomatis dengan peninjauan manusia untuk mempercepat proses anotasi tanpa sepenuhnya mengorbankan kualitas label. Nasution dan Onan (2024) menunjukkan bahwa label yang dihasilkan oleh </w:t>
+      </w:r>
+      <w:r>
+        <w:rPr>
+          <w:i/>
+        </w:rPr>
+        <w:t>Large Language Model</w:t>
+      </w:r>
+      <w:r>
+        <w:t xml:space="preserve"> dapat mendekati kualitas label manusia pada tugas pemrosesan bahasa alami untuk bahasa bersumber daya rendah, namun tetap memiliki celah pada kasus linguistik yang kompleks. Jadhav dkk. (2025) juga menegaskan bahwa performa LLM sebagai anotator masih tertinggal dibandingkan model yang di-</w:t>
+      </w:r>
+      <w:r>
+        <w:rPr>
+          <w:i/>
+        </w:rPr>
+        <w:t>fine-tune</w:t>
+      </w:r>
+      <w:r>
+        <w:t xml:space="preserve"> secara khusus ketika diterapkan pada bahasa bersumber daya rendah. Selain pendekatan berbasis LLM, terdapat pula pendekatan pelabelan awal semi-otomatis berbasis aturan (</w:t>
+      </w:r>
+      <w:r>
+        <w:rPr>
+          <w:i/>
+        </w:rPr>
+        <w:t>rule-based</w:t>
+      </w:r>
+      <w:r>
+        <w:t>), yang menggunakan daftar kata kunci atau pola linguistik sederhana untuk memberikan label awal sebelum dilakukan adjudikasi manual. Pendekatan semacam ini belum banyak dievaluasi secara eksplisit dari sisi pola kesalahan sistematis yang mungkin ditinggalkannya.</w:t>
       </w:r>
     </w:p>
     <w:p>
@@ -136,7 +283,26 @@
           <w:color w:val="000000"/>
           <w:sz w:val="24"/>
         </w:rPr>
-        <w:t>2.1.5 Ketidakseimbangan Kelas (Class Imbalance) dalam Klasifikasi Teks</w:t>
+        <w:t>2.1.5 Ketidakseimbangan Kelas (</w:t>
+      </w:r>
+      <w:r>
+        <w:rPr>
+          <w:rFonts w:ascii="Times New Roman" w:hAnsi="Times New Roman"/>
+          <w:b/>
+          <w:i/>
+          <w:color w:val="000000"/>
+          <w:sz w:val="24"/>
+        </w:rPr>
+        <w:t>Class Imbalance</w:t>
+      </w:r>
+      <w:r>
+        <w:rPr>
+          <w:rFonts w:ascii="Times New Roman" w:hAnsi="Times New Roman"/>
+          <w:b/>
+          <w:color w:val="000000"/>
+          <w:sz w:val="24"/>
+        </w:rPr>
+        <w:t>) dalam Klasifikasi Teks</w:t>
       </w:r>
     </w:p>
     <w:p>
@@ -144,7 +310,70 @@
         <w:jc w:val="both"/>
       </w:pPr>
       <w:r>
-        <w:t>Ketidakseimbangan kelas terjadi ketika proporsi antar kelas pada suatu dataset tidak merata, sehingga model klasifikasi cenderung bias terhadap kelas mayoritas dan kurang mampu mengenali pola pada kelas minoritas. Henning dkk. (2023) mengelompokkan pendekatan penanganan ketidakseimbangan kelas pada NLP berbasis deep learning menjadi beberapa kategori, meliputi teknik sampling, augmentasi data, penyesuaian fungsi loss, staged learning, dan modifikasi arsitektur model. Salah satu teknik sampling yang umum digunakan adalah Synthetic Minority Over-sampling Technique (SMOTE), yang menghasilkan sampel sintetis pada kelas minoritas berdasarkan interpolasi antar sampel yang sudah ada (Chawla, Bowyer, Hall, &amp; Kegelmeyer, 2002). Taskiran dkk. (2025) melakukan evaluasi komprehensif terhadap SMOTE beserta puluhan variannya pada tugas klasifikasi teks, dan menunjukkan bahwa efektivitas masing-masing teknik oversampling dapat bervariasi tergantung karakteristik data. Henning dkk. (2023) juga menekankan bahwa sumber ketidakseimbangan kelas tidak selalu berasal dari distribusi data secara alami, tetapi dapat pula terbentuk akibat proses anotasi yang bias, sebuah aspek yang menjadi dasar pertanyaan penelitian ini.</w:t>
+        <w:t xml:space="preserve">Ketidakseimbangan kelas terjadi ketika proporsi antar kelas pada suatu dataset tidak merata, sehingga model klasifikasi cenderung bias terhadap kelas mayoritas dan kurang mampu mengenali pola pada kelas minoritas. Henning dkk. (2023) mengelompokkan pendekatan penanganan ketidakseimbangan kelas pada pemrosesan bahasa alami berbasis </w:t>
+      </w:r>
+      <w:r>
+        <w:rPr>
+          <w:i/>
+        </w:rPr>
+        <w:t>deep learning</w:t>
+      </w:r>
+      <w:r>
+        <w:t xml:space="preserve"> menjadi beberapa kategori, meliputi teknik </w:t>
+      </w:r>
+      <w:r>
+        <w:rPr>
+          <w:i/>
+        </w:rPr>
+        <w:t>sampling</w:t>
+      </w:r>
+      <w:r>
+        <w:t xml:space="preserve">, augmentasi data, penyesuaian fungsi </w:t>
+      </w:r>
+      <w:r>
+        <w:rPr>
+          <w:i/>
+        </w:rPr>
+        <w:t>loss</w:t>
+      </w:r>
+      <w:r>
+        <w:t xml:space="preserve">, </w:t>
+      </w:r>
+      <w:r>
+        <w:rPr>
+          <w:i/>
+        </w:rPr>
+        <w:t>staged learning</w:t>
+      </w:r>
+      <w:r>
+        <w:t xml:space="preserve">, dan modifikasi arsitektur model. Salah satu teknik </w:t>
+      </w:r>
+      <w:r>
+        <w:rPr>
+          <w:i/>
+        </w:rPr>
+        <w:t>sampling</w:t>
+      </w:r>
+      <w:r>
+        <w:t xml:space="preserve"> yang umum digunakan adalah </w:t>
+      </w:r>
+      <w:r>
+        <w:rPr>
+          <w:i/>
+        </w:rPr>
+        <w:t>Synthetic Minority Over-sampling Technique</w:t>
+      </w:r>
+      <w:r>
+        <w:t xml:space="preserve"> (SMOTE), yang menghasilkan sampel sintetis pada kelas minoritas berdasarkan interpolasi antar sampel yang sudah ada (Chawla dkk., 2002). Taskiran dkk. (2025) melakukan evaluasi komprehensif terhadap SMOTE beserta puluhan variannya pada tugas klasifikasi teks, dan menunjukkan bahwa efektivitas masing-masing teknik </w:t>
+      </w:r>
+      <w:r>
+        <w:rPr>
+          <w:i/>
+        </w:rPr>
+        <w:t>oversampling</w:t>
+      </w:r>
+      <w:r>
+        <w:t xml:space="preserve"> dapat bervariasi tergantung karakteristik data. Henning dkk. (2023) juga menekankan bahwa sumber ketidakseimbangan kelas tidak selalu berasal dari distribusi data secara alami, tetapi dapat pula terbentuk akibat proses anotasi yang bias, sebuah aspek yang menjadi dasar pertanyaan penelitian ini.</w:t>
       </w:r>
     </w:p>
     <w:p>
@@ -167,7 +396,16 @@
         <w:jc w:val="both"/>
       </w:pPr>
       <w:r>
-        <w:t>Sarkasme merupakan salah satu tantangan utama dalam analisis sentimen karena penuturnya menyampaikan sentimen negatif menggunakan kata-kata yang secara literal bermakna positif (Joshi, Bhattacharyya, &amp; Carman, 2017). Kunneman, Liebrecht, van Mulken, dan van den Bosch (2015) mengidentifikasi sejumlah penanda linguistik sarkasme, seperti penggunaan hiperbola dan hashtag tertentu, yang dapat membantu membedakan ujaran sarkastik dari ujaran literal. Pada konteks Bahasa Indonesia, Lunando dan Purwarianti (2015) menunjukkan bahwa sarkasme juga menjadi tantangan signifikan pada teks media sosial berbahasa Indonesia, dan mengusulkan fitur tambahan berupa informasi negasi dan jumlah kata seru untuk membantu mendeteksinya. Ketiga studi ini menjadi dasar argumen bahwa kesulitan mendeteksi sentimen negatif pada penelitian ini kemungkinan besar berkaitan dengan fenomena sarkasme dan sentimen implisit yang tidak tertangkap oleh pendekatan pelabelan berbasis kata kunci sederhana.</w:t>
+        <w:t xml:space="preserve">Sarkasme merupakan salah satu tantangan utama dalam analisis sentimen karena penuturnya menyampaikan sentimen negatif menggunakan kata-kata yang secara literal bermakna positif (Joshi dkk., 2017). Kunneman dkk. (2015) mengidentifikasi sejumlah penanda linguistik sarkasme, seperti penggunaan hiperbola dan </w:t>
+      </w:r>
+      <w:r>
+        <w:rPr>
+          <w:i/>
+        </w:rPr>
+        <w:t>hashtag</w:t>
+      </w:r>
+      <w:r>
+        <w:t xml:space="preserve"> tertentu, yang dapat membantu membedakan ujaran sarkastik dari ujaran literal. Pada konteks Bahasa Indonesia, Lunando dan Purwarianti (2015) menunjukkan bahwa sarkasme juga menjadi tantangan signifikan pada teks media sosial berbahasa Indonesia, dan mengusulkan fitur tambahan berupa informasi negasi dan jumlah kata seru untuk membantu mendeteksinya. Ketiga studi ini menjadi dasar argumen bahwa kesulitan mendeteksi sentimen negatif pada penelitian ini kemungkinan besar berkaitan dengan fenomena sarkasme dan sentimen implisit yang tidak tertangkap oleh pendekatan pelabelan berbasis kata kunci sederhana.</w:t>
       </w:r>
     </w:p>
     <w:p>
@@ -190,7 +428,25 @@
         <w:jc w:val="both"/>
       </w:pPr>
       <w:r>
-        <w:t>Cohen's Kappa adalah statistik yang digunakan untuk mengukur tingkat kesepakatan antara dua penilai (rater) pada data kategorikal, dengan memperhitungkan kemungkinan kesepakatan yang terjadi secara kebetulan. Landis dan Koch (1977) mengusulkan skala interpretasi nilai Kappa, di mana nilai di atas 0,81 dikategorikan sebagai kesepakatan "hampir sempurna" (almost perfect agreement). Pada penelitian ini, Cohen's Kappa digunakan untuk mengukur tingkat kesepakatan antara label hasil pelabelan semi-otomatis dan label hasil adjudikasi manual, sebagai dasar kuantitatif untuk mengidentifikasi ada tidaknya bias sistematis pada proses pelabelan.</w:t>
+        <w:t>Cohen's Kappa adalah statistik yang digunakan untuk mengukur tingkat kesepakatan antara dua penilai (</w:t>
+      </w:r>
+      <w:r>
+        <w:rPr>
+          <w:i/>
+        </w:rPr>
+        <w:t>rater</w:t>
+      </w:r>
+      <w:r>
+        <w:t>) pada data kategorikal, dengan memperhitungkan kemungkinan kesepakatan yang terjadi secara kebetulan. Landis dan Koch (1977) mengusulkan skala interpretasi nilai Kappa, di mana nilai di atas 0,81 dikategorikan sebagai kesepakatan hampir sempurna (</w:t>
+      </w:r>
+      <w:r>
+        <w:rPr>
+          <w:i/>
+        </w:rPr>
+        <w:t>almost perfect agreement</w:t>
+      </w:r>
+      <w:r>
+        <w:t>). Pada penelitian ini, Cohen's Kappa digunakan untuk mengukur tingkat kesepakatan antara label hasil pelabelan semi-otomatis dan label hasil adjudikasi manual, sebagai dasar kuantitatif untuk mengidentifikasi ada tidaknya bias sistematis pada proses pelabelan.</w:t>
       </w:r>
     </w:p>
     <w:p>
@@ -221,7 +477,7 @@
         <w:jc w:val="both"/>
       </w:pPr>
       <w:r>
-        <w:t>| No | Peneliti (Tahun) | Metode &amp; Objek | Temuan Utama | Perbedaan dengan Penelitian Ini |</w:t>
+        <w:t>| No | Peneliti (Tahun) | Metode dan Objek | Temuan Utama | Perbedaan dengan Penelitian Ini |</w:t>
       </w:r>
     </w:p>
     <w:p>
@@ -237,7 +493,25 @@
         <w:jc w:val="both"/>
       </w:pPr>
       <w:r>
-        <w:t>| 1 | Pateman, Prasetyo, &amp; Sujadi (2025) | SVM + SMOTE pada sentimen pemerintah di TikTok dan X | Akurasi meningkat dari 61% ke 76% (TikTok) dan 74% ke 86% (X) setelah SMOTE diterapkan | Sentimen negatif berperan sebagai kelas mayoritas (arah imbalance berlawanan dengan MBG); tidak menelusuri kemungkinan sumber imbalance dari proses pelabelan |</w:t>
+        <w:t xml:space="preserve">| 1 | Pateman dkk. (2025) | SVM dan SMOTE pada sentimen pemerintah di TikTok dan X | Akurasi meningkat dari 61% ke 76% (TikTok) dan 74% ke 86% (X) setelah SMOTE diterapkan | Sentimen negatif berperan sebagai kelas mayoritas (arah </w:t>
+      </w:r>
+      <w:r>
+        <w:rPr>
+          <w:i/>
+        </w:rPr>
+        <w:t>imbalance</w:t>
+      </w:r>
+      <w:r>
+        <w:t xml:space="preserve"> berlawanan dengan MBG); tidak menelusuri kemungkinan sumber </w:t>
+      </w:r>
+      <w:r>
+        <w:rPr>
+          <w:i/>
+        </w:rPr>
+        <w:t>imbalance</w:t>
+      </w:r>
+      <w:r>
+        <w:t xml:space="preserve"> dari proses pelabelan |</w:t>
       </w:r>
     </w:p>
     <w:p>
@@ -245,7 +519,34 @@
         <w:jc w:val="both"/>
       </w:pPr>
       <w:r>
-        <w:t>| 2 | Penulis UNNES, Scientific Journal of Informatics (2026) | Stacked LSTM + SMOTE pada komentar Instagram terkait kebijakan Program MBG | Perbandingan ablasi 4 konfigurasi LSTM dengan dan tanpa SMOTE | Fokus pada perbandingan arsitektur deep learning, bukan pada sumber bias di tahap pelabelan; platform berbeda (Instagram) |</w:t>
+        <w:t xml:space="preserve">| 2 | Penulis UNNES, </w:t>
+      </w:r>
+      <w:r>
+        <w:rPr>
+          <w:i/>
+        </w:rPr>
+        <w:t>Scientific Journal of Informatics</w:t>
+      </w:r>
+      <w:r>
+        <w:t xml:space="preserve"> (2026) | </w:t>
+      </w:r>
+      <w:r>
+        <w:rPr>
+          <w:i/>
+        </w:rPr>
+        <w:t>Stacked</w:t>
+      </w:r>
+      <w:r>
+        <w:t xml:space="preserve"> LSTM dan SMOTE pada komentar Instagram terkait kebijakan Program MBG | Perbandingan ablasi 4 konfigurasi LSTM dengan dan tanpa SMOTE | Fokus pada perbandingan arsitektur </w:t>
+      </w:r>
+      <w:r>
+        <w:rPr>
+          <w:i/>
+        </w:rPr>
+        <w:t>deep learning</w:t>
+      </w:r>
+      <w:r>
+        <w:t>, bukan pada sumber bias di tahap pelabelan; platform berbeda (Instagram) |</w:t>
       </w:r>
     </w:p>
     <w:p>
@@ -253,7 +554,16 @@
         <w:jc w:val="both"/>
       </w:pPr>
       <w:r>
-        <w:t>| 3 | Rofi'i (2026) | SMOTE + GridSearchCV pada isu reshuffle kabinet | Distribusi kelas asli 83,5% negatif dan 16,5% positif; SMOTE menurunkan bias kelas mayoritas | Ketidakseimbangan kelas dianggap sebagai karakteristik data yang sudah ada, bukan hasil telaah proses pelabelan |</w:t>
+        <w:t xml:space="preserve">| 3 | Rofi'i (2026) | SMOTE dan </w:t>
+      </w:r>
+      <w:r>
+        <w:rPr>
+          <w:i/>
+        </w:rPr>
+        <w:t>GridSearchCV</w:t>
+      </w:r>
+      <w:r>
+        <w:t xml:space="preserve"> pada isu reshuffle kabinet | Distribusi kelas asli 83,5% negatif dan 16,5% positif; SMOTE menurunkan bias kelas mayoritas | Ketidakseimbangan kelas dianggap sebagai karakteristik data yang sudah ada, bukan hasil telaah proses pelabelan |</w:t>
       </w:r>
     </w:p>
     <w:p>
@@ -269,7 +579,25 @@
         <w:jc w:val="both"/>
       </w:pPr>
       <w:r>
-        <w:t>| 5 | Riwaldi &amp; Aripin (2026) | Hybrid CNN-BiLSTM untuk sentimen multi-platform terkait insiden keamanan pangan Program MBG | Model hybrid CNN-BiLSTM untuk klasifikasi sentimen | Berfokus pada perbandingan arsitektur model, bukan pada proses pelabelan data |</w:t>
+        <w:t xml:space="preserve">| 5 | Riwaldi dan Aripin (2026) | </w:t>
+      </w:r>
+      <w:r>
+        <w:rPr>
+          <w:i/>
+        </w:rPr>
+        <w:t>Hybrid</w:t>
+      </w:r>
+      <w:r>
+        <w:t xml:space="preserve"> CNN-BiLSTM untuk sentimen multi-platform terkait insiden keamanan pangan Program MBG | Model </w:t>
+      </w:r>
+      <w:r>
+        <w:rPr>
+          <w:i/>
+        </w:rPr>
+        <w:t>hybrid</w:t>
+      </w:r>
+      <w:r>
+        <w:t xml:space="preserve"> CNN-BiLSTM untuk klasifikasi sentimen | Berfokus pada perbandingan arsitektur model, bukan pada proses pelabelan data |</w:t>
       </w:r>
     </w:p>
     <w:p>
@@ -277,7 +605,7 @@
         <w:jc w:val="both"/>
       </w:pPr>
       <w:r>
-        <w:t>| 6 | Nasution &amp; Onan (2024) | Perbandingan kualitas label manusia dan LLM pada tugas NLP bahasa bersumber daya rendah | Label AI mendekati kualitas label manusia namun memiliki celah pada kasus kompleks | Domain penelitian bersifat umum (bukan sentimen kebijakan pemerintah Indonesia) dan tidak dikaitkan dengan dampaknya terhadap performa klasifikasi pada kelas minoritas |</w:t>
+        <w:t>| 6 | Nasution dan Onan (2024) | Perbandingan kualitas label manusia dan LLM pada tugas pemrosesan bahasa alami untuk bahasa bersumber daya rendah | Label AI mendekati kualitas label manusia namun memiliki celah pada kasus kompleks | Domain penelitian bersifat umum (bukan sentimen kebijakan pemerintah Indonesia) dan tidak dikaitkan dengan dampaknya terhadap performa klasifikasi pada kelas minoritas |</w:t>
       </w:r>
     </w:p>
     <w:p>
@@ -308,7 +636,16 @@
         <w:jc w:val="both"/>
       </w:pPr>
       <w:r>
-        <w:t>Penelitian ini disusun berdasarkan alur berpikir sebagai berikut. Data opini publik terkait Program MBG dikumpulkan melalui crawling media sosial, kemudian melalui tahap pra-pelabelan semi-otomatis berbasis aturan sebagai langkah percepatan. Label awal tersebut kemudian diadjudikasi secara manual untuk menghasilkan label akhir yang lebih andal. Pada titik ini, penelitian mengukur tingkat kesepakatan antara label awal dan label akhir menggunakan Cohen's Kappa, sekaligus mengidentifikasi pola kesalahan sistematis yang muncul selama adjudikasi.</w:t>
+        <w:t xml:space="preserve">Penelitian ini disusun berdasarkan alur berpikir sebagai berikut. Data opini publik terkait Program MBG dikumpulkan melalui </w:t>
+      </w:r>
+      <w:r>
+        <w:rPr>
+          <w:i/>
+        </w:rPr>
+        <w:t>crawling</w:t>
+      </w:r>
+      <w:r>
+        <w:t xml:space="preserve"> media sosial, kemudian melalui tahap pra-pelabelan semi-otomatis berbasis aturan sebagai langkah percepatan. Label awal tersebut kemudian diadjudikasi secara manual untuk menghasilkan label akhir yang lebih andal. Pada titik ini, penelitian mengukur tingkat kesepakatan antara label awal dan label akhir menggunakan Cohen's Kappa, sekaligus mengidentifikasi pola kesalahan sistematis yang muncul selama adjudikasi.</w:t>
       </w:r>
     </w:p>
     <w:p>

</xml_diff>